<commit_message>
HACCP Sansepolcro: aggiunge personale IGS e AD Beverage
Co-Authored-By: Claude Opus 5.5 <noreply@anthropic.com>
Claude-Session: https://claude.ai/code/session_0141r6itvrqnqND36aWv4h2p
</commit_message>
<xml_diff>
--- a/haccp/HACCP_ADBeverage_Sansepolcro.docx
+++ b/haccp/HACCP_ADBeverage_Sansepolcro.docx
@@ -1611,6 +1611,41 @@
                 <w:szCs w:val="18"/>
               </w:rPr>
               <w:t xml:space="preserve">Amministratore: Sig. Pera Luigi</w:t>
+            </w:r>
+          </w:p>
+        </w:tc>
+      </w:tr>
+      <w:tr>
+        <w:trPr>
+          <w:tblHeader w:val="false"/>
+        </w:trPr>
+        <w:tc>
+          <w:tcPr>
+            <w:tcW w:type="dxa" w:w="9638"/>
+            <w:tcBorders>
+              <w:top w:val="single" w:color="808080" w:sz="4"/>
+              <w:left w:val="single" w:color="808080" w:sz="4"/>
+              <w:bottom w:val="single" w:color="808080" w:sz="4"/>
+              <w:right w:val="single" w:color="808080" w:sz="4"/>
+            </w:tcBorders>
+            <w:tcMar>
+              <w:top w:type="dxa" w:w="50"/>
+              <w:left w:type="dxa" w:w="90"/>
+              <w:bottom w:type="dxa" w:w="50"/>
+              <w:right w:type="dxa" w:w="90"/>
+            </w:tcMar>
+            <w:vAlign w:val="center"/>
+          </w:tcPr>
+          <w:p>
+            <w:pPr>
+              <w:jc w:val="left"/>
+            </w:pPr>
+            <w:r>
+              <w:rPr>
+                <w:sz w:val="18"/>
+                <w:szCs w:val="18"/>
+              </w:rPr>
+              <w:t xml:space="preserve">Personale AD Beverage nello stabilimento: Sig. Angeli Massimo – impiegato amministrativo</w:t>
             </w:r>
           </w:p>
         </w:tc>
@@ -6168,7 +6203,7 @@
         <w:jc w:val="both"/>
       </w:pPr>
       <w:r>
-        <w:t xml:space="preserve">Per AD Beverage S.p.A.: Sig. Pera Luigi (Responsabile dell’autocontrollo) e personale amministrativo dello stabilimento</w:t>
+        <w:t xml:space="preserve">Per AD Beverage S.p.A.: Sig. Pera Luigi (Responsabile dell’autocontrollo) e Sig. Angeli Massimo (impiegato amministrativo dello stabilimento)</w:t>
       </w:r>
     </w:p>
     <w:p>
@@ -29607,7 +29642,7 @@
                 <w:sz w:val="16"/>
                 <w:szCs w:val="16"/>
               </w:rPr>
-              <w:t xml:space="preserve"> </w:t>
+              <w:t xml:space="preserve">Angeli Massimo</w:t>
             </w:r>
           </w:p>
         </w:tc>
@@ -29637,7 +29672,7 @@
                 <w:sz w:val="16"/>
                 <w:szCs w:val="16"/>
               </w:rPr>
-              <w:t xml:space="preserve"> </w:t>
+              <w:t xml:space="preserve">Impiegato amministrativo</w:t>
             </w:r>
           </w:p>
         </w:tc>

</xml_diff>